<commit_message>
feat: consolida OS institucional e politica comercial
</commit_message>
<xml_diff>
--- a/04-templates/docx/os-padrao.docx
+++ b/04-templates/docx/os-padrao.docx
@@ -2,6 +2,398 @@
 <file path=word/document.xml><?xml version="1.0" encoding="utf-8"?>
 <w:document xmlns:wpc="http://schemas.microsoft.com/office/word/2010/wordprocessingCanvas" xmlns:mo="http://schemas.microsoft.com/office/mac/office/2008/main" xmlns:mc="http://schemas.openxmlformats.org/markup-compatibility/2006" xmlns:mv="urn:schemas-microsoft-com:mac:vml" xmlns:o="urn:schemas-microsoft-com:office:office" xmlns:r="http://schemas.openxmlformats.org/officeDocument/2006/relationships" xmlns:m="http://schemas.openxmlformats.org/officeDocument/2006/math" xmlns:v="urn:schemas-microsoft-com:vml" xmlns:wp14="http://schemas.microsoft.com/office/word/2010/wordprocessingDrawing" xmlns:wp="http://schemas.openxmlformats.org/drawingml/2006/wordprocessingDrawing" xmlns:w10="urn:schemas-microsoft-com:office:word" xmlns:w="http://schemas.openxmlformats.org/wordprocessingml/2006/main" xmlns:w14="http://schemas.microsoft.com/office/word/2010/wordml" xmlns:wpg="http://schemas.microsoft.com/office/word/2010/wordprocessingGroup" xmlns:wpi="http://schemas.microsoft.com/office/word/2010/wordprocessingInk" xmlns:wne="http://schemas.microsoft.com/office/word/2006/wordml" xmlns:wps="http://schemas.microsoft.com/office/word/2010/wordprocessingShape" mc:Ignorable="w14 wp14">
   <w:body>
+    <w:p>
+      <w:pPr>
+        <w:spacing w:before="1800" w:after="120"/>
+        <w:jc w:val="center"/>
+      </w:pPr>
+      <w:r>
+        <w:rPr>
+          <w:rFonts w:ascii="Aptos" w:hAnsi="Aptos"/>
+          <w:b/>
+          <w:color w:val="7030A0"/>
+          <w:sz w:val="80"/>
+        </w:rPr>
+        <w:t>ORDEM DE SERVIÇO</w:t>
+      </w:r>
+    </w:p>
+    <w:p>
+      <w:pPr>
+        <w:spacing w:after="960"/>
+        <w:jc w:val="center"/>
+      </w:pPr>
+      <w:r>
+        <w:rPr>
+          <w:rFonts w:ascii="Aptos" w:hAnsi="Aptos"/>
+          <w:i/>
+          <w:color w:val="595959"/>
+          <w:sz w:val="28"/>
+        </w:rPr>
+        <w:t>Especificação Funcional e Condições de Execução</w:t>
+      </w:r>
+    </w:p>
+    <w:tbl>
+      <w:tblPr>
+        <w:tblW w:type="auto" w:w="0"/>
+        <w:jc w:val="center"/>
+        <w:tblLayout w:type="fixed"/>
+        <w:tblLook w:firstColumn="1" w:firstRow="1" w:lastColumn="0" w:lastRow="0" w:noHBand="0" w:noVBand="1" w:val="04A0"/>
+      </w:tblPr>
+      <w:tblGrid>
+        <w:gridCol w:w="2948"/>
+        <w:gridCol w:w="4989"/>
+      </w:tblGrid>
+      <w:tr>
+        <w:tc>
+          <w:tcPr>
+            <w:tcW w:type="dxa" w:w="2948"/>
+          </w:tcPr>
+          <w:p>
+            <w:pPr>
+              <w:spacing w:after="160"/>
+            </w:pPr>
+            <w:r/>
+            <w:r>
+              <w:rPr>
+                <w:rFonts w:ascii="Aptos" w:hAnsi="Aptos"/>
+                <w:b/>
+                <w:i w:val="0"/>
+                <w:color w:val="0F4761"/>
+                <w:sz w:val="22"/>
+              </w:rPr>
+              <w:t>Código da OS:</w:t>
+            </w:r>
+          </w:p>
+        </w:tc>
+        <w:tc>
+          <w:tcPr>
+            <w:tcW w:type="dxa" w:w="4989"/>
+          </w:tcPr>
+          <w:p>
+            <w:pPr>
+              <w:spacing w:after="160"/>
+            </w:pPr>
+            <w:r/>
+            <w:r>
+              <w:rPr>
+                <w:rFonts w:ascii="Aptos" w:hAnsi="Aptos"/>
+                <w:b w:val="0"/>
+                <w:i w:val="0"/>
+                <w:color w:val="262B33"/>
+                <w:sz w:val="22"/>
+              </w:rPr>
+            </w:r>
+          </w:p>
+        </w:tc>
+      </w:tr>
+      <w:tr>
+        <w:tc>
+          <w:tcPr>
+            <w:tcW w:type="dxa" w:w="2948"/>
+          </w:tcPr>
+          <w:p>
+            <w:pPr>
+              <w:spacing w:after="160"/>
+            </w:pPr>
+            <w:r/>
+            <w:r>
+              <w:rPr>
+                <w:rFonts w:ascii="Aptos" w:hAnsi="Aptos"/>
+                <w:b/>
+                <w:i w:val="0"/>
+                <w:color w:val="0F4761"/>
+                <w:sz w:val="22"/>
+              </w:rPr>
+              <w:t>Nome da demanda:</w:t>
+            </w:r>
+          </w:p>
+        </w:tc>
+        <w:tc>
+          <w:tcPr>
+            <w:tcW w:type="dxa" w:w="4989"/>
+          </w:tcPr>
+          <w:p>
+            <w:pPr>
+              <w:spacing w:after="160"/>
+            </w:pPr>
+            <w:r/>
+            <w:r>
+              <w:rPr>
+                <w:rFonts w:ascii="Aptos" w:hAnsi="Aptos"/>
+                <w:b w:val="0"/>
+                <w:i w:val="0"/>
+                <w:color w:val="262B33"/>
+                <w:sz w:val="22"/>
+              </w:rPr>
+            </w:r>
+          </w:p>
+        </w:tc>
+      </w:tr>
+      <w:tr>
+        <w:tc>
+          <w:tcPr>
+            <w:tcW w:type="dxa" w:w="2948"/>
+          </w:tcPr>
+          <w:p>
+            <w:pPr>
+              <w:spacing w:after="160"/>
+            </w:pPr>
+            <w:r/>
+            <w:r>
+              <w:rPr>
+                <w:rFonts w:ascii="Aptos" w:hAnsi="Aptos"/>
+                <w:b/>
+                <w:i w:val="0"/>
+                <w:color w:val="0F4761"/>
+                <w:sz w:val="22"/>
+              </w:rPr>
+              <w:t>Contratante:</w:t>
+            </w:r>
+          </w:p>
+        </w:tc>
+        <w:tc>
+          <w:tcPr>
+            <w:tcW w:type="dxa" w:w="4989"/>
+          </w:tcPr>
+          <w:p>
+            <w:pPr>
+              <w:spacing w:after="160"/>
+            </w:pPr>
+            <w:r/>
+            <w:r>
+              <w:rPr>
+                <w:rFonts w:ascii="Aptos" w:hAnsi="Aptos"/>
+                <w:b w:val="0"/>
+                <w:i w:val="0"/>
+                <w:color w:val="262B33"/>
+                <w:sz w:val="22"/>
+              </w:rPr>
+            </w:r>
+          </w:p>
+        </w:tc>
+      </w:tr>
+      <w:tr>
+        <w:tc>
+          <w:tcPr>
+            <w:tcW w:type="dxa" w:w="2948"/>
+          </w:tcPr>
+          <w:p>
+            <w:pPr>
+              <w:spacing w:after="160"/>
+            </w:pPr>
+            <w:r/>
+            <w:r>
+              <w:rPr>
+                <w:rFonts w:ascii="Aptos" w:hAnsi="Aptos"/>
+                <w:b/>
+                <w:i w:val="0"/>
+                <w:color w:val="0F4761"/>
+                <w:sz w:val="22"/>
+              </w:rPr>
+              <w:t>Cliente/Projeto:</w:t>
+            </w:r>
+          </w:p>
+        </w:tc>
+        <w:tc>
+          <w:tcPr>
+            <w:tcW w:type="dxa" w:w="4989"/>
+          </w:tcPr>
+          <w:p>
+            <w:pPr>
+              <w:spacing w:after="160"/>
+            </w:pPr>
+            <w:r/>
+            <w:r>
+              <w:rPr>
+                <w:rFonts w:ascii="Aptos" w:hAnsi="Aptos"/>
+                <w:b w:val="0"/>
+                <w:i w:val="0"/>
+                <w:color w:val="262B33"/>
+                <w:sz w:val="22"/>
+              </w:rPr>
+            </w:r>
+          </w:p>
+        </w:tc>
+      </w:tr>
+      <w:tr>
+        <w:tc>
+          <w:tcPr>
+            <w:tcW w:type="dxa" w:w="2948"/>
+          </w:tcPr>
+          <w:p>
+            <w:pPr>
+              <w:spacing w:after="160"/>
+            </w:pPr>
+            <w:r/>
+            <w:r>
+              <w:rPr>
+                <w:rFonts w:ascii="Aptos" w:hAnsi="Aptos"/>
+                <w:b/>
+                <w:i w:val="0"/>
+                <w:color w:val="0F4761"/>
+                <w:sz w:val="22"/>
+              </w:rPr>
+              <w:t>Executor:</w:t>
+            </w:r>
+          </w:p>
+        </w:tc>
+        <w:tc>
+          <w:tcPr>
+            <w:tcW w:type="dxa" w:w="4989"/>
+          </w:tcPr>
+          <w:p>
+            <w:pPr>
+              <w:spacing w:after="160"/>
+            </w:pPr>
+            <w:r/>
+            <w:r>
+              <w:rPr>
+                <w:rFonts w:ascii="Aptos" w:hAnsi="Aptos"/>
+                <w:b w:val="0"/>
+                <w:i w:val="0"/>
+                <w:color w:val="262B33"/>
+                <w:sz w:val="22"/>
+              </w:rPr>
+            </w:r>
+          </w:p>
+        </w:tc>
+      </w:tr>
+      <w:tr>
+        <w:tc>
+          <w:tcPr>
+            <w:tcW w:type="dxa" w:w="2948"/>
+          </w:tcPr>
+          <w:p>
+            <w:pPr>
+              <w:spacing w:after="160"/>
+            </w:pPr>
+            <w:r/>
+            <w:r>
+              <w:rPr>
+                <w:rFonts w:ascii="Aptos" w:hAnsi="Aptos"/>
+                <w:b/>
+                <w:i w:val="0"/>
+                <w:color w:val="0F4761"/>
+                <w:sz w:val="22"/>
+              </w:rPr>
+              <w:t>Data de emissão:</w:t>
+            </w:r>
+          </w:p>
+        </w:tc>
+        <w:tc>
+          <w:tcPr>
+            <w:tcW w:type="dxa" w:w="4989"/>
+          </w:tcPr>
+          <w:p>
+            <w:pPr>
+              <w:spacing w:after="160"/>
+            </w:pPr>
+            <w:r/>
+            <w:r>
+              <w:rPr>
+                <w:rFonts w:ascii="Aptos" w:hAnsi="Aptos"/>
+                <w:b w:val="0"/>
+                <w:i w:val="0"/>
+                <w:color w:val="262B33"/>
+                <w:sz w:val="22"/>
+              </w:rPr>
+            </w:r>
+          </w:p>
+        </w:tc>
+      </w:tr>
+      <w:tr>
+        <w:tc>
+          <w:tcPr>
+            <w:tcW w:type="dxa" w:w="2948"/>
+          </w:tcPr>
+          <w:p>
+            <w:pPr>
+              <w:spacing w:after="160"/>
+            </w:pPr>
+            <w:r/>
+            <w:r>
+              <w:rPr>
+                <w:rFonts w:ascii="Aptos" w:hAnsi="Aptos"/>
+                <w:b/>
+                <w:i w:val="0"/>
+                <w:color w:val="0F4761"/>
+                <w:sz w:val="22"/>
+              </w:rPr>
+              <w:t>Versão:</w:t>
+            </w:r>
+          </w:p>
+        </w:tc>
+        <w:tc>
+          <w:tcPr>
+            <w:tcW w:type="dxa" w:w="4989"/>
+          </w:tcPr>
+          <w:p>
+            <w:pPr>
+              <w:spacing w:after="160"/>
+            </w:pPr>
+            <w:r/>
+            <w:r>
+              <w:rPr>
+                <w:rFonts w:ascii="Aptos" w:hAnsi="Aptos"/>
+                <w:b w:val="0"/>
+                <w:i w:val="0"/>
+                <w:color w:val="262B33"/>
+                <w:sz w:val="22"/>
+              </w:rPr>
+            </w:r>
+          </w:p>
+        </w:tc>
+      </w:tr>
+      <w:tr>
+        <w:tc>
+          <w:tcPr>
+            <w:tcW w:type="dxa" w:w="2948"/>
+          </w:tcPr>
+          <w:p>
+            <w:pPr>
+              <w:spacing w:after="160"/>
+            </w:pPr>
+            <w:r/>
+            <w:r>
+              <w:rPr>
+                <w:rFonts w:ascii="Aptos" w:hAnsi="Aptos"/>
+                <w:b/>
+                <w:i w:val="0"/>
+                <w:color w:val="0F4761"/>
+                <w:sz w:val="22"/>
+              </w:rPr>
+              <w:t>Status:</w:t>
+            </w:r>
+          </w:p>
+        </w:tc>
+        <w:tc>
+          <w:tcPr>
+            <w:tcW w:type="dxa" w:w="4989"/>
+          </w:tcPr>
+          <w:p>
+            <w:pPr>
+              <w:spacing w:after="160"/>
+            </w:pPr>
+            <w:r/>
+            <w:r>
+              <w:rPr>
+                <w:rFonts w:ascii="Aptos" w:hAnsi="Aptos"/>
+                <w:b w:val="0"/>
+                <w:i w:val="0"/>
+                <w:color w:val="262B33"/>
+                <w:sz w:val="22"/>
+              </w:rPr>
+            </w:r>
+          </w:p>
+        </w:tc>
+      </w:tr>
+    </w:tbl>
+    <w:p>
+      <w:r>
+        <w:br/>
+        <w:br w:type="page"/>
+      </w:r>
+    </w:p>
     <w:p>
       <w:pPr/>
       <w:r>
@@ -12,7 +404,7 @@
       <w:headerReference w:type="default" r:id="rId9"/>
       <w:footerReference w:type="default" r:id="rId10"/>
       <w:pgSz w:w="11906" w:h="16838"/>
-      <w:pgMar w:top="1417" w:right="1417" w:bottom="1134" w:left="1417" w:header="709" w:footer="709" w:gutter="0"/>
+      <w:pgMar w:top="1843" w:right="1701" w:bottom="1417" w:left="1701" w:header="708" w:footer="530" w:gutter="0"/>
       <w:cols w:space="720"/>
       <w:docGrid w:linePitch="360"/>
     </w:sectPr>
@@ -27,37 +419,42 @@
       <w:pStyle w:val="Footer"/>
       <w:jc w:val="center"/>
     </w:pPr>
+    <w:r/>
     <w:r>
       <w:rPr>
-        <w:color w:val="3D4A5C"/>
+        <w:rFonts w:ascii="Aptos" w:hAnsi="Aptos"/>
+        <w:color w:val="595959"/>
         <w:sz w:val="18"/>
       </w:rPr>
       <w:t xml:space="preserve">Página </w:t>
     </w:r>
     <w:r>
       <w:rPr>
-        <w:color w:val="3D4A5C"/>
+        <w:rFonts w:ascii="Aptos" w:hAnsi="Aptos"/>
+        <w:color w:val="595959"/>
         <w:sz w:val="18"/>
       </w:rPr>
       <w:fldChar w:fldCharType="begin"/>
-      <w:instrText xml:space="preserve">PAGE</w:instrText>
+      <w:instrText xml:space="preserve"> PAGE </w:instrText>
       <w:fldChar w:fldCharType="separate"/>
       <w:fldChar w:fldCharType="end"/>
     </w:r>
     <w:r>
       <w:rPr>
-        <w:color w:val="3D4A5C"/>
+        <w:rFonts w:ascii="Aptos" w:hAnsi="Aptos"/>
+        <w:color w:val="595959"/>
         <w:sz w:val="18"/>
       </w:rPr>
       <w:t xml:space="preserve"> de </w:t>
     </w:r>
     <w:r>
       <w:rPr>
-        <w:color w:val="3D4A5C"/>
+        <w:rFonts w:ascii="Aptos" w:hAnsi="Aptos"/>
+        <w:color w:val="595959"/>
         <w:sz w:val="18"/>
       </w:rPr>
       <w:fldChar w:fldCharType="begin"/>
-      <w:instrText xml:space="preserve">NUMPAGES</w:instrText>
+      <w:instrText xml:space="preserve"> NUMPAGES </w:instrText>
       <w:fldChar w:fldCharType="separate"/>
       <w:fldChar w:fldCharType="end"/>
     </w:r>
@@ -69,12 +466,110 @@
 <w:hdr xmlns:m="http://schemas.openxmlformats.org/officeDocument/2006/math" xmlns:mc="http://schemas.openxmlformats.org/markup-compatibility/2006" xmlns:mo="http://schemas.microsoft.com/office/mac/office/2008/main" xmlns:mv="urn:schemas-microsoft-com:mac:vml" xmlns:o="urn:schemas-microsoft-com:office:office" xmlns:r="http://schemas.openxmlformats.org/officeDocument/2006/relationships" xmlns:v="urn:schemas-microsoft-com:vml" xmlns:w10="urn:schemas-microsoft-com:office:word" xmlns:w14="http://schemas.microsoft.com/office/word/2010/wordml" xmlns:w="http://schemas.openxmlformats.org/wordprocessingml/2006/main" xmlns:wne="http://schemas.microsoft.com/office/word/2006/wordml" xmlns:wp14="http://schemas.microsoft.com/office/word/2010/wordprocessingDrawing" xmlns:wp="http://schemas.openxmlformats.org/drawingml/2006/wordprocessingDrawing" xmlns:wpc="http://schemas.microsoft.com/office/word/2010/wordprocessingCanvas" xmlns:wpg="http://schemas.microsoft.com/office/word/2010/wordprocessingGroup" xmlns:wpi="http://schemas.microsoft.com/office/word/2010/wordprocessingInk" xmlns:wps="http://schemas.microsoft.com/office/word/2010/wordprocessingShape" mc:Ignorable="w14 wp14">
   <w:p>
     <w:pPr>
+      <w:pStyle w:val="Header"/>
+    </w:pPr>
+    <w:r/>
+    <w:r>
+      <w:rPr>
+        <w:noProof/>
+      </w:rPr>
+      <w:drawing>
+        <wp:anchor distT="0" distB="0" distL="0" distR="0" simplePos="0" relativeHeight="251658240" behindDoc="0" locked="0" layoutInCell="1" allowOverlap="1">
+          <wp:simplePos x="0" y="0"/>
+          <wp:positionH relativeFrom="page">
+            <wp:posOffset>0</wp:posOffset>
+          </wp:positionH>
+          <wp:positionV relativeFrom="page">
+            <wp:posOffset>0</wp:posOffset>
+          </wp:positionV>
+          <wp:extent cx="7560310" cy="1080000"/>
+          <wp:effectExtent l="0" t="0" r="0" b="0"/>
+          <wp:wrapNone/>
+          <wp:docPr id="1" name="TriaHeaderBand"/>
+          <wp:cNvGraphicFramePr/>
+          <a:graphic xmlns:a="http://schemas.openxmlformats.org/drawingml/2006/main">
+            <a:graphicData uri="http://schemas.microsoft.com/office/word/2010/wordprocessingShape">
+              <wps:wsp>
+                <wps:cNvSpPr/>
+                <wps:spPr>
+                  <a:xfrm>
+                    <a:off x="0" y="0"/>
+                    <a:ext cx="7560310" cy="1080000"/>
+                  </a:xfrm>
+                  <a:prstGeom prst="rect">
+                    <a:avLst/>
+                  </a:prstGeom>
+                  <a:solidFill>
+                    <a:srgbClr val="7030A0"/>
+                  </a:solidFill>
+                </wps:spPr>
+                <wps:txbx>
+                  <w:txbxContent>
+                    <w:p>
+                      <w:pPr>
+                        <w:jc w:val="center"/>
+                      </w:pPr>
+                      <w:r>
+                        <w:rPr>
+                          <w:noProof/>
+                        </w:rPr>
+                        <w:drawing>
+                          <wp:inline distT="0" distB="0" distL="0" distR="0">
+                            <wp:extent cx="1384300" cy="778510"/>
+                            <wp:effectExtent l="0" t="0" r="0" b="0"/>
+                            <wp:docPr id="2" name="TriaLogo"/>
+                            <wp:cNvGraphicFramePr>
+                              <a:graphicFrameLocks noChangeAspect="1"/>
+                            </wp:cNvGraphicFramePr>
+                            <a:graphic>
+                              <a:graphicData uri="http://schemas.openxmlformats.org/drawingml/2006/picture">
+                                <pic:pic xmlns:pic="http://schemas.openxmlformats.org/drawingml/2006/picture">
+                                  <pic:nvPicPr>
+                                    <pic:cNvPr id="0" name="TriaLogoImg"/>
+                                    <pic:cNvPicPr/>
+                                  </pic:nvPicPr>
+                                  <pic:blipFill>
+                                    <a:blip r:embed="rId1"/>
+                                    <a:stretch>
+                                      <a:fillRect/>
+                                    </a:stretch>
+                                  </pic:blipFill>
+                                  <pic:spPr>
+                                    <a:xfrm>
+                                      <a:off x="0" y="0"/>
+                                      <a:ext cx="1384300" cy="778510"/>
+                                    </a:xfrm>
+                                    <a:prstGeom prst="rect">
+                                      <a:avLst/>
+                                    </a:prstGeom>
+                                  </pic:spPr>
+                                </pic:pic>
+                              </a:graphicData>
+                            </a:graphic>
+                          </wp:inline>
+                        </w:drawing>
+                      </w:r>
+                    </w:p>
+                  </w:txbxContent>
+                </wps:txbx>
+                <wps:bodyPr anchor="ctr"/>
+              </wps:wsp>
+            </a:graphicData>
+          </a:graphic>
+        </wp:anchor>
+      </w:drawing>
+    </w:r>
+  </w:p>
+  <w:p>
+    <w:pPr>
+      <w:spacing w:before="960"/>
       <w:jc w:val="right"/>
     </w:pPr>
     <w:r>
       <w:rPr>
+        <w:rFonts w:ascii="Aptos" w:hAnsi="Aptos"/>
         <w:i/>
-        <w:color w:val="3D4A5C"/>
+        <w:color w:val="595959"/>
         <w:sz w:val="18"/>
       </w:rPr>
       <w:t>Especificação Funcional / Ordem de Serviço</w:t>
@@ -447,10 +942,10 @@
     <w:qFormat/>
     <w:rsid w:val="00FC693F"/>
     <w:pPr>
-      <w:spacing w:before="0" w:after="160" w:line="276" w:lineRule="auto"/>
+      <w:spacing w:after="120" w:line="276" w:lineRule="auto"/>
     </w:pPr>
     <w:rPr>
-      <w:rFonts w:ascii="Calibri" w:hAnsi="Calibri"/>
+      <w:rFonts w:ascii="Aptos" w:hAnsi="Aptos"/>
       <w:color w:val="262B33"/>
       <w:sz w:val="22"/>
     </w:rPr>
@@ -510,16 +1005,14 @@
     <w:pPr>
       <w:keepNext/>
       <w:keepLines/>
-      <w:pageBreakBefore w:val="0"/>
-      <w:spacing w:before="360" w:after="160"/>
+      <w:spacing w:before="320" w:after="160"/>
       <w:outlineLvl w:val="0"/>
     </w:pPr>
     <w:rPr>
-      <w:rFonts w:asciiTheme="majorHAnsi" w:eastAsiaTheme="majorEastAsia" w:hAnsiTheme="majorHAnsi" w:cstheme="majorBidi" w:ascii="Calibri" w:hAnsi="Calibri"/>
+      <w:rFonts w:asciiTheme="majorHAnsi" w:eastAsiaTheme="majorEastAsia" w:hAnsiTheme="majorHAnsi" w:cstheme="majorBidi" w:ascii="Aptos" w:hAnsi="Aptos"/>
       <w:b/>
       <w:bCs/>
-      <w:i w:val="0"/>
-      <w:color w:val="3D4A5C"/>
+      <w:color w:val="0F4761"/>
       <w:sz w:val="30"/>
       <w:szCs w:val="28"/>
     </w:rPr>
@@ -540,10 +1033,9 @@
       <w:outlineLvl w:val="1"/>
     </w:pPr>
     <w:rPr>
-      <w:rFonts w:asciiTheme="majorHAnsi" w:eastAsiaTheme="majorEastAsia" w:hAnsiTheme="majorHAnsi" w:cstheme="majorBidi" w:ascii="Calibri" w:hAnsi="Calibri"/>
+      <w:rFonts w:asciiTheme="majorHAnsi" w:eastAsiaTheme="majorEastAsia" w:hAnsiTheme="majorHAnsi" w:cstheme="majorBidi" w:ascii="Aptos" w:hAnsi="Aptos"/>
       <w:b/>
       <w:bCs/>
-      <w:i w:val="0"/>
       <w:color w:val="262B33"/>
       <w:sz w:val="25"/>
       <w:szCs w:val="26"/>
@@ -565,7 +1057,7 @@
       <w:outlineLvl w:val="2"/>
     </w:pPr>
     <w:rPr>
-      <w:rFonts w:asciiTheme="majorHAnsi" w:eastAsiaTheme="majorEastAsia" w:hAnsiTheme="majorHAnsi" w:cstheme="majorBidi" w:ascii="Calibri" w:hAnsi="Calibri"/>
+      <w:rFonts w:asciiTheme="majorHAnsi" w:eastAsiaTheme="majorEastAsia" w:hAnsiTheme="majorHAnsi" w:cstheme="majorBidi" w:ascii="Aptos" w:hAnsi="Aptos"/>
       <w:b/>
       <w:bCs/>
       <w:i/>
@@ -804,14 +1296,13 @@
       <w:pBdr>
         <w:bottom w:val="single" w:sz="8" w:space="4" w:color="4F81BD" w:themeColor="accent1"/>
       </w:pBdr>
-      <w:spacing w:after="360" w:line="240" w:lineRule="auto" w:before="0"/>
+      <w:spacing w:after="240" w:line="240" w:lineRule="auto" w:before="360"/>
       <w:contextualSpacing/>
-      <w:jc w:val="left"/>
     </w:pPr>
     <w:rPr>
-      <w:rFonts w:asciiTheme="majorHAnsi" w:eastAsiaTheme="majorEastAsia" w:hAnsiTheme="majorHAnsi" w:cstheme="majorBidi" w:ascii="Calibri" w:hAnsi="Calibri"/>
+      <w:rFonts w:asciiTheme="majorHAnsi" w:eastAsiaTheme="majorEastAsia" w:hAnsiTheme="majorHAnsi" w:cstheme="majorBidi" w:ascii="Aptos" w:hAnsi="Aptos"/>
       <w:b/>
-      <w:color w:val="262B33"/>
+      <w:color w:val="0F4761"/>
       <w:spacing w:val="5"/>
       <w:kern w:val="28"/>
       <w:sz w:val="44"/>
@@ -845,12 +1336,13 @@
       <w:numPr>
         <w:ilvl w:val="1"/>
       </w:numPr>
+      <w:spacing w:after="240"/>
     </w:pPr>
     <w:rPr>
-      <w:rFonts w:asciiTheme="majorHAnsi" w:eastAsiaTheme="majorEastAsia" w:hAnsiTheme="majorHAnsi" w:cstheme="majorBidi" w:ascii="Calibri" w:hAnsi="Calibri"/>
+      <w:rFonts w:asciiTheme="majorHAnsi" w:eastAsiaTheme="majorEastAsia" w:hAnsiTheme="majorHAnsi" w:cstheme="majorBidi" w:ascii="Aptos" w:hAnsi="Aptos"/>
       <w:i/>
       <w:iCs/>
-      <w:color w:val="3D4A5C"/>
+      <w:color w:val="595959"/>
       <w:spacing w:val="15"/>
       <w:sz w:val="24"/>
       <w:szCs w:val="24"/>
@@ -988,11 +1480,10 @@
       <w:numPr>
         <w:numId w:val="1"/>
       </w:numPr>
-      <w:spacing w:after="80" w:line="264" w:lineRule="auto"/>
       <w:contextualSpacing/>
     </w:pPr>
     <w:rPr>
-      <w:rFonts w:ascii="Calibri" w:hAnsi="Calibri"/>
+      <w:rFonts w:ascii="Aptos" w:hAnsi="Aptos"/>
       <w:color w:val="262B33"/>
       <w:sz w:val="22"/>
     </w:rPr>
@@ -1255,15 +1746,15 @@
     <w:qFormat/>
     <w:rsid w:val="00FC693F"/>
     <w:pPr>
-      <w:spacing w:line="240" w:lineRule="auto" w:before="80" w:after="240"/>
+      <w:spacing w:line="240" w:lineRule="auto" w:after="200"/>
       <w:jc w:val="center"/>
     </w:pPr>
     <w:rPr>
-      <w:rFonts w:ascii="Calibri" w:hAnsi="Calibri"/>
-      <w:b w:val="0"/>
+      <w:rFonts w:ascii="Aptos" w:hAnsi="Aptos"/>
+      <w:b/>
       <w:bCs/>
       <w:i/>
-      <w:color w:val="3D4A5C"/>
+      <w:color w:val="595959"/>
       <w:sz w:val="19"/>
       <w:szCs w:val="18"/>
     </w:rPr>
@@ -1306,7 +1797,7 @@
       <w:ind w:left="936" w:right="936"/>
     </w:pPr>
     <w:rPr>
-      <w:rFonts w:ascii="Calibri" w:hAnsi="Calibri"/>
+      <w:rFonts w:ascii="Aptos" w:hAnsi="Aptos"/>
       <w:b/>
       <w:bCs/>
       <w:i/>

</xml_diff>